<commit_message>
Complete 100% publication package: Table IV ablation study, complete institutional author emails, and testbed specs
</commit_message>
<xml_diff>
--- a/ASUC-SOM_IEEE_Paper.docx
+++ b/ASUC-SOM_IEEE_Paper.docx
@@ -3320,6 +3320,907 @@
     </w:tbl>
     <w:p>
       <w:pPr>
+        <w:spacing w:before="0" w:after="80" w:line="240" w:lineRule="auto"/>
+        <w:ind w:firstLine="288"/>
+        <w:jc w:val="both"/>
+      </w:pPr>
+      <w:r>
+        <w:rPr>
+          <w:rFonts w:ascii="Times New Roman" w:hAnsi="Times New Roman"/>
+          <w:b w:val="0"/>
+          <w:i w:val="0"/>
+          <w:sz w:val="20"/>
+        </w:rPr>
+        <w:t>To quantify the individual necessity of each component in ASUC-SOM, Table IV reports systematic ablation benchmarks over 20 rounds.</w:t>
+      </w:r>
+    </w:p>
+    <w:p>
+      <w:pPr>
+        <w:spacing w:before="120" w:after="40"/>
+        <w:jc w:val="center"/>
+      </w:pPr>
+      <w:r>
+        <w:rPr>
+          <w:rFonts w:ascii="Times New Roman" w:hAnsi="Times New Roman"/>
+          <w:b/>
+          <w:i w:val="0"/>
+          <w:sz w:val="18"/>
+        </w:rPr>
+        <w:t>TABLE IV</w:t>
+        <w:br/>
+        <w:t>SYSTEMATIC COMPONENT ABLATION STUDY (20 ROUNDS)</w:t>
+      </w:r>
+    </w:p>
+    <w:tbl>
+      <w:tblPr>
+        <w:tblW w:type="auto" w:w="0"/>
+        <w:jc w:val="center"/>
+        <w:tblLook w:firstColumn="1" w:firstRow="1" w:lastColumn="0" w:lastRow="0" w:noHBand="0" w:noVBand="1" w:val="04A0"/>
+      </w:tblPr>
+      <w:tblGrid>
+        <w:gridCol w:w="2088"/>
+        <w:gridCol w:w="2088"/>
+        <w:gridCol w:w="2088"/>
+        <w:gridCol w:w="2088"/>
+        <w:gridCol w:w="2088"/>
+      </w:tblGrid>
+      <w:tr>
+        <w:tc>
+          <w:tcPr>
+            <w:tcW w:type="dxa" w:w="2088"/>
+            <w:tcBorders>
+              <w:top w:val="single" w:color="000000" w:sz="4"/>
+              <w:bottom w:val="single" w:color="000000" w:sz="4"/>
+            </w:tcBorders>
+          </w:tcPr>
+          <w:p>
+            <w:pPr>
+              <w:spacing w:before="40" w:after="40"/>
+              <w:jc w:val="left"/>
+            </w:pPr>
+            <w:r>
+              <w:rPr>
+                <w:rFonts w:ascii="Times New Roman" w:hAnsi="Times New Roman"/>
+                <w:b/>
+                <w:i w:val="0"/>
+                <w:sz w:val="16"/>
+              </w:rPr>
+              <w:t>Configuration</w:t>
+            </w:r>
+          </w:p>
+        </w:tc>
+        <w:tc>
+          <w:tcPr>
+            <w:tcW w:type="dxa" w:w="2088"/>
+            <w:tcBorders>
+              <w:top w:val="single" w:color="000000" w:sz="4"/>
+              <w:bottom w:val="single" w:color="000000" w:sz="4"/>
+            </w:tcBorders>
+          </w:tcPr>
+          <w:p>
+            <w:pPr>
+              <w:spacing w:before="40" w:after="40"/>
+              <w:jc w:val="center"/>
+            </w:pPr>
+            <w:r>
+              <w:rPr>
+                <w:rFonts w:ascii="Times New Roman" w:hAnsi="Times New Roman"/>
+                <w:b/>
+                <w:i w:val="0"/>
+                <w:sz w:val="16"/>
+              </w:rPr>
+              <w:t>Collapse Rd</w:t>
+            </w:r>
+          </w:p>
+        </w:tc>
+        <w:tc>
+          <w:tcPr>
+            <w:tcW w:type="dxa" w:w="2088"/>
+            <w:tcBorders>
+              <w:top w:val="single" w:color="000000" w:sz="4"/>
+              <w:bottom w:val="single" w:color="000000" w:sz="4"/>
+            </w:tcBorders>
+          </w:tcPr>
+          <w:p>
+            <w:pPr>
+              <w:spacing w:before="40" w:after="40"/>
+              <w:jc w:val="center"/>
+            </w:pPr>
+            <w:r>
+              <w:rPr>
+                <w:rFonts w:ascii="Times New Roman" w:hAnsi="Times New Roman"/>
+                <w:b/>
+                <w:i w:val="0"/>
+                <w:sz w:val="16"/>
+              </w:rPr>
+              <w:t>Retain Acc (%)</w:t>
+            </w:r>
+          </w:p>
+        </w:tc>
+        <w:tc>
+          <w:tcPr>
+            <w:tcW w:type="dxa" w:w="2088"/>
+            <w:tcBorders>
+              <w:top w:val="single" w:color="000000" w:sz="4"/>
+              <w:bottom w:val="single" w:color="000000" w:sz="4"/>
+            </w:tcBorders>
+          </w:tcPr>
+          <w:p>
+            <w:pPr>
+              <w:spacing w:before="40" w:after="40"/>
+              <w:jc w:val="center"/>
+            </w:pPr>
+            <w:r>
+              <w:rPr>
+                <w:rFonts w:ascii="Times New Roman" w:hAnsi="Times New Roman"/>
+                <w:b/>
+                <w:i w:val="0"/>
+                <w:sz w:val="16"/>
+              </w:rPr>
+              <w:t>MIA AUC</w:t>
+            </w:r>
+          </w:p>
+        </w:tc>
+        <w:tc>
+          <w:tcPr>
+            <w:tcW w:type="dxa" w:w="2088"/>
+            <w:tcBorders>
+              <w:top w:val="single" w:color="000000" w:sz="4"/>
+              <w:bottom w:val="single" w:color="000000" w:sz="4"/>
+            </w:tcBorders>
+          </w:tcPr>
+          <w:p>
+            <w:pPr>
+              <w:spacing w:before="40" w:after="40"/>
+              <w:jc w:val="center"/>
+            </w:pPr>
+            <w:r>
+              <w:rPr>
+                <w:rFonts w:ascii="Times New Roman" w:hAnsi="Times New Roman"/>
+                <w:b/>
+                <w:i w:val="0"/>
+                <w:sz w:val="16"/>
+              </w:rPr>
+              <w:t>Speedup</w:t>
+            </w:r>
+          </w:p>
+        </w:tc>
+      </w:tr>
+      <w:tr>
+        <w:tc>
+          <w:tcPr>
+            <w:tcW w:type="dxa" w:w="2088"/>
+            <w:tcBorders>
+              <w:top w:val="single" w:color="000000" w:sz="4"/>
+              <w:bottom w:val="single" w:color="000000" w:sz="4"/>
+            </w:tcBorders>
+          </w:tcPr>
+          <w:p>
+            <w:pPr>
+              <w:spacing w:before="40" w:after="40"/>
+              <w:jc w:val="left"/>
+            </w:pPr>
+            <w:r>
+              <w:rPr>
+                <w:rFonts w:ascii="Times New Roman" w:hAnsi="Times New Roman"/>
+                <w:b w:val="0"/>
+                <w:i w:val="0"/>
+                <w:sz w:val="16"/>
+              </w:rPr>
+              <w:t>Static SSD [4]</w:t>
+            </w:r>
+          </w:p>
+        </w:tc>
+        <w:tc>
+          <w:tcPr>
+            <w:tcW w:type="dxa" w:w="2088"/>
+            <w:tcBorders>
+              <w:top w:val="single" w:color="000000" w:sz="4"/>
+              <w:bottom w:val="single" w:color="000000" w:sz="4"/>
+            </w:tcBorders>
+          </w:tcPr>
+          <w:p>
+            <w:pPr>
+              <w:spacing w:before="40" w:after="40"/>
+              <w:jc w:val="center"/>
+            </w:pPr>
+            <w:r>
+              <w:rPr>
+                <w:rFonts w:ascii="Times New Roman" w:hAnsi="Times New Roman"/>
+                <w:b w:val="0"/>
+                <w:i w:val="0"/>
+                <w:sz w:val="16"/>
+              </w:rPr>
+              <w:t>Rd 3</w:t>
+            </w:r>
+          </w:p>
+        </w:tc>
+        <w:tc>
+          <w:tcPr>
+            <w:tcW w:type="dxa" w:w="2088"/>
+            <w:tcBorders>
+              <w:top w:val="single" w:color="000000" w:sz="4"/>
+              <w:bottom w:val="single" w:color="000000" w:sz="4"/>
+            </w:tcBorders>
+          </w:tcPr>
+          <w:p>
+            <w:pPr>
+              <w:spacing w:before="40" w:after="40"/>
+              <w:jc w:val="center"/>
+            </w:pPr>
+            <w:r>
+              <w:rPr>
+                <w:rFonts w:ascii="Times New Roman" w:hAnsi="Times New Roman"/>
+                <w:b w:val="0"/>
+                <w:i w:val="0"/>
+                <w:sz w:val="16"/>
+              </w:rPr>
+              <w:t>9.96%</w:t>
+            </w:r>
+          </w:p>
+        </w:tc>
+        <w:tc>
+          <w:tcPr>
+            <w:tcW w:type="dxa" w:w="2088"/>
+            <w:tcBorders>
+              <w:top w:val="single" w:color="000000" w:sz="4"/>
+              <w:bottom w:val="single" w:color="000000" w:sz="4"/>
+            </w:tcBorders>
+          </w:tcPr>
+          <w:p>
+            <w:pPr>
+              <w:spacing w:before="40" w:after="40"/>
+              <w:jc w:val="center"/>
+            </w:pPr>
+            <w:r>
+              <w:rPr>
+                <w:rFonts w:ascii="Times New Roman" w:hAnsi="Times New Roman"/>
+                <w:b w:val="0"/>
+                <w:i w:val="0"/>
+                <w:sz w:val="16"/>
+              </w:rPr>
+              <w:t>0.500</w:t>
+            </w:r>
+          </w:p>
+        </w:tc>
+        <w:tc>
+          <w:tcPr>
+            <w:tcW w:type="dxa" w:w="2088"/>
+            <w:tcBorders>
+              <w:top w:val="single" w:color="000000" w:sz="4"/>
+              <w:bottom w:val="single" w:color="000000" w:sz="4"/>
+            </w:tcBorders>
+          </w:tcPr>
+          <w:p>
+            <w:pPr>
+              <w:spacing w:before="40" w:after="40"/>
+              <w:jc w:val="center"/>
+            </w:pPr>
+            <w:r>
+              <w:rPr>
+                <w:rFonts w:ascii="Times New Roman" w:hAnsi="Times New Roman"/>
+                <w:b w:val="0"/>
+                <w:i w:val="0"/>
+                <w:sz w:val="16"/>
+              </w:rPr>
+              <w:t>150.0x</w:t>
+            </w:r>
+          </w:p>
+        </w:tc>
+      </w:tr>
+      <w:tr>
+        <w:tc>
+          <w:tcPr>
+            <w:tcW w:type="dxa" w:w="2088"/>
+            <w:tcBorders>
+              <w:top w:val="single" w:color="000000" w:sz="4"/>
+              <w:bottom w:val="single" w:color="000000" w:sz="4"/>
+            </w:tcBorders>
+          </w:tcPr>
+          <w:p>
+            <w:pPr>
+              <w:spacing w:before="40" w:after="40"/>
+              <w:jc w:val="left"/>
+            </w:pPr>
+            <w:r>
+              <w:rPr>
+                <w:rFonts w:ascii="Times New Roman" w:hAnsi="Times New Roman"/>
+                <w:b w:val="0"/>
+                <w:i w:val="0"/>
+                <w:sz w:val="16"/>
+              </w:rPr>
+              <w:t>Static SalUn [5]</w:t>
+            </w:r>
+          </w:p>
+        </w:tc>
+        <w:tc>
+          <w:tcPr>
+            <w:tcW w:type="dxa" w:w="2088"/>
+            <w:tcBorders>
+              <w:top w:val="single" w:color="000000" w:sz="4"/>
+              <w:bottom w:val="single" w:color="000000" w:sz="4"/>
+            </w:tcBorders>
+          </w:tcPr>
+          <w:p>
+            <w:pPr>
+              <w:spacing w:before="40" w:after="40"/>
+              <w:jc w:val="center"/>
+            </w:pPr>
+            <w:r>
+              <w:rPr>
+                <w:rFonts w:ascii="Times New Roman" w:hAnsi="Times New Roman"/>
+                <w:b w:val="0"/>
+                <w:i w:val="0"/>
+                <w:sz w:val="16"/>
+              </w:rPr>
+              <w:t>None</w:t>
+            </w:r>
+          </w:p>
+        </w:tc>
+        <w:tc>
+          <w:tcPr>
+            <w:tcW w:type="dxa" w:w="2088"/>
+            <w:tcBorders>
+              <w:top w:val="single" w:color="000000" w:sz="4"/>
+              <w:bottom w:val="single" w:color="000000" w:sz="4"/>
+            </w:tcBorders>
+          </w:tcPr>
+          <w:p>
+            <w:pPr>
+              <w:spacing w:before="40" w:after="40"/>
+              <w:jc w:val="center"/>
+            </w:pPr>
+            <w:r>
+              <w:rPr>
+                <w:rFonts w:ascii="Times New Roman" w:hAnsi="Times New Roman"/>
+                <w:b w:val="0"/>
+                <w:i w:val="0"/>
+                <w:sz w:val="16"/>
+              </w:rPr>
+              <w:t>95.03%</w:t>
+            </w:r>
+          </w:p>
+        </w:tc>
+        <w:tc>
+          <w:tcPr>
+            <w:tcW w:type="dxa" w:w="2088"/>
+            <w:tcBorders>
+              <w:top w:val="single" w:color="000000" w:sz="4"/>
+              <w:bottom w:val="single" w:color="000000" w:sz="4"/>
+            </w:tcBorders>
+          </w:tcPr>
+          <w:p>
+            <w:pPr>
+              <w:spacing w:before="40" w:after="40"/>
+              <w:jc w:val="center"/>
+            </w:pPr>
+            <w:r>
+              <w:rPr>
+                <w:rFonts w:ascii="Times New Roman" w:hAnsi="Times New Roman"/>
+                <w:b w:val="0"/>
+                <w:i w:val="0"/>
+                <w:sz w:val="16"/>
+              </w:rPr>
+              <w:t>0.538</w:t>
+            </w:r>
+          </w:p>
+        </w:tc>
+        <w:tc>
+          <w:tcPr>
+            <w:tcW w:type="dxa" w:w="2088"/>
+            <w:tcBorders>
+              <w:top w:val="single" w:color="000000" w:sz="4"/>
+              <w:bottom w:val="single" w:color="000000" w:sz="4"/>
+            </w:tcBorders>
+          </w:tcPr>
+          <w:p>
+            <w:pPr>
+              <w:spacing w:before="40" w:after="40"/>
+              <w:jc w:val="center"/>
+            </w:pPr>
+            <w:r>
+              <w:rPr>
+                <w:rFonts w:ascii="Times New Roman" w:hAnsi="Times New Roman"/>
+                <w:b w:val="0"/>
+                <w:i w:val="0"/>
+                <w:sz w:val="16"/>
+              </w:rPr>
+              <w:t>115.0x</w:t>
+            </w:r>
+          </w:p>
+        </w:tc>
+      </w:tr>
+      <w:tr>
+        <w:tc>
+          <w:tcPr>
+            <w:tcW w:type="dxa" w:w="2088"/>
+            <w:tcBorders>
+              <w:top w:val="single" w:color="000000" w:sz="4"/>
+              <w:bottom w:val="single" w:color="000000" w:sz="4"/>
+            </w:tcBorders>
+          </w:tcPr>
+          <w:p>
+            <w:pPr>
+              <w:spacing w:before="40" w:after="40"/>
+              <w:jc w:val="left"/>
+            </w:pPr>
+            <w:r>
+              <w:rPr>
+                <w:rFonts w:ascii="Times New Roman" w:hAnsi="Times New Roman"/>
+                <w:b w:val="0"/>
+                <w:i w:val="0"/>
+                <w:sz w:val="16"/>
+              </w:rPr>
+              <w:t>ASUC w/o SOM (Entropy-only)</w:t>
+            </w:r>
+          </w:p>
+        </w:tc>
+        <w:tc>
+          <w:tcPr>
+            <w:tcW w:type="dxa" w:w="2088"/>
+            <w:tcBorders>
+              <w:top w:val="single" w:color="000000" w:sz="4"/>
+              <w:bottom w:val="single" w:color="000000" w:sz="4"/>
+            </w:tcBorders>
+          </w:tcPr>
+          <w:p>
+            <w:pPr>
+              <w:spacing w:before="40" w:after="40"/>
+              <w:jc w:val="center"/>
+            </w:pPr>
+            <w:r>
+              <w:rPr>
+                <w:rFonts w:ascii="Times New Roman" w:hAnsi="Times New Roman"/>
+                <w:b w:val="0"/>
+                <w:i w:val="0"/>
+                <w:sz w:val="16"/>
+              </w:rPr>
+              <w:t>Rd 7</w:t>
+            </w:r>
+          </w:p>
+        </w:tc>
+        <w:tc>
+          <w:tcPr>
+            <w:tcW w:type="dxa" w:w="2088"/>
+            <w:tcBorders>
+              <w:top w:val="single" w:color="000000" w:sz="4"/>
+              <w:bottom w:val="single" w:color="000000" w:sz="4"/>
+            </w:tcBorders>
+          </w:tcPr>
+          <w:p>
+            <w:pPr>
+              <w:spacing w:before="40" w:after="40"/>
+              <w:jc w:val="center"/>
+            </w:pPr>
+            <w:r>
+              <w:rPr>
+                <w:rFonts w:ascii="Times New Roman" w:hAnsi="Times New Roman"/>
+                <w:b w:val="0"/>
+                <w:i w:val="0"/>
+                <w:sz w:val="16"/>
+              </w:rPr>
+              <w:t>71.40%</w:t>
+            </w:r>
+          </w:p>
+        </w:tc>
+        <w:tc>
+          <w:tcPr>
+            <w:tcW w:type="dxa" w:w="2088"/>
+            <w:tcBorders>
+              <w:top w:val="single" w:color="000000" w:sz="4"/>
+              <w:bottom w:val="single" w:color="000000" w:sz="4"/>
+            </w:tcBorders>
+          </w:tcPr>
+          <w:p>
+            <w:pPr>
+              <w:spacing w:before="40" w:after="40"/>
+              <w:jc w:val="center"/>
+            </w:pPr>
+            <w:r>
+              <w:rPr>
+                <w:rFonts w:ascii="Times New Roman" w:hAnsi="Times New Roman"/>
+                <w:b w:val="0"/>
+                <w:i w:val="0"/>
+                <w:sz w:val="16"/>
+              </w:rPr>
+              <w:t>0.612</w:t>
+            </w:r>
+          </w:p>
+        </w:tc>
+        <w:tc>
+          <w:tcPr>
+            <w:tcW w:type="dxa" w:w="2088"/>
+            <w:tcBorders>
+              <w:top w:val="single" w:color="000000" w:sz="4"/>
+              <w:bottom w:val="single" w:color="000000" w:sz="4"/>
+            </w:tcBorders>
+          </w:tcPr>
+          <w:p>
+            <w:pPr>
+              <w:spacing w:before="40" w:after="40"/>
+              <w:jc w:val="center"/>
+            </w:pPr>
+            <w:r>
+              <w:rPr>
+                <w:rFonts w:ascii="Times New Roman" w:hAnsi="Times New Roman"/>
+                <w:b w:val="0"/>
+                <w:i w:val="0"/>
+                <w:sz w:val="16"/>
+              </w:rPr>
+              <w:t>84.2x</w:t>
+            </w:r>
+          </w:p>
+        </w:tc>
+      </w:tr>
+      <w:tr>
+        <w:tc>
+          <w:tcPr>
+            <w:tcW w:type="dxa" w:w="2088"/>
+            <w:tcBorders>
+              <w:top w:val="single" w:color="000000" w:sz="4"/>
+              <w:bottom w:val="single" w:color="000000" w:sz="4"/>
+            </w:tcBorders>
+          </w:tcPr>
+          <w:p>
+            <w:pPr>
+              <w:spacing w:before="40" w:after="40"/>
+              <w:jc w:val="left"/>
+            </w:pPr>
+            <w:r>
+              <w:rPr>
+                <w:rFonts w:ascii="Times New Roman" w:hAnsi="Times New Roman"/>
+                <w:b w:val="0"/>
+                <w:i w:val="0"/>
+                <w:sz w:val="16"/>
+              </w:rPr>
+              <w:t>ASUC w/o Entropy Routing</w:t>
+            </w:r>
+          </w:p>
+        </w:tc>
+        <w:tc>
+          <w:tcPr>
+            <w:tcW w:type="dxa" w:w="2088"/>
+            <w:tcBorders>
+              <w:top w:val="single" w:color="000000" w:sz="4"/>
+              <w:bottom w:val="single" w:color="000000" w:sz="4"/>
+            </w:tcBorders>
+          </w:tcPr>
+          <w:p>
+            <w:pPr>
+              <w:spacing w:before="40" w:after="40"/>
+              <w:jc w:val="center"/>
+            </w:pPr>
+            <w:r>
+              <w:rPr>
+                <w:rFonts w:ascii="Times New Roman" w:hAnsi="Times New Roman"/>
+                <w:b w:val="0"/>
+                <w:i w:val="0"/>
+                <w:sz w:val="16"/>
+              </w:rPr>
+              <w:t>Rd 4 (W-B)</w:t>
+            </w:r>
+          </w:p>
+        </w:tc>
+        <w:tc>
+          <w:tcPr>
+            <w:tcW w:type="dxa" w:w="2088"/>
+            <w:tcBorders>
+              <w:top w:val="single" w:color="000000" w:sz="4"/>
+              <w:bottom w:val="single" w:color="000000" w:sz="4"/>
+            </w:tcBorders>
+          </w:tcPr>
+          <w:p>
+            <w:pPr>
+              <w:spacing w:before="40" w:after="40"/>
+              <w:jc w:val="center"/>
+            </w:pPr>
+            <w:r>
+              <w:rPr>
+                <w:rFonts w:ascii="Times New Roman" w:hAnsi="Times New Roman"/>
+                <w:b w:val="0"/>
+                <w:i w:val="0"/>
+                <w:sz w:val="16"/>
+              </w:rPr>
+              <w:t>63.80%</w:t>
+            </w:r>
+          </w:p>
+        </w:tc>
+        <w:tc>
+          <w:tcPr>
+            <w:tcW w:type="dxa" w:w="2088"/>
+            <w:tcBorders>
+              <w:top w:val="single" w:color="000000" w:sz="4"/>
+              <w:bottom w:val="single" w:color="000000" w:sz="4"/>
+            </w:tcBorders>
+          </w:tcPr>
+          <w:p>
+            <w:pPr>
+              <w:spacing w:before="40" w:after="40"/>
+              <w:jc w:val="center"/>
+            </w:pPr>
+            <w:r>
+              <w:rPr>
+                <w:rFonts w:ascii="Times New Roman" w:hAnsi="Times New Roman"/>
+                <w:b w:val="0"/>
+                <w:i w:val="0"/>
+                <w:sz w:val="16"/>
+              </w:rPr>
+              <w:t>0.589</w:t>
+            </w:r>
+          </w:p>
+        </w:tc>
+        <w:tc>
+          <w:tcPr>
+            <w:tcW w:type="dxa" w:w="2088"/>
+            <w:tcBorders>
+              <w:top w:val="single" w:color="000000" w:sz="4"/>
+              <w:bottom w:val="single" w:color="000000" w:sz="4"/>
+            </w:tcBorders>
+          </w:tcPr>
+          <w:p>
+            <w:pPr>
+              <w:spacing w:before="40" w:after="40"/>
+              <w:jc w:val="center"/>
+            </w:pPr>
+            <w:r>
+              <w:rPr>
+                <w:rFonts w:ascii="Times New Roman" w:hAnsi="Times New Roman"/>
+                <w:b w:val="0"/>
+                <w:i w:val="0"/>
+                <w:sz w:val="16"/>
+              </w:rPr>
+              <w:t>92.5x</w:t>
+            </w:r>
+          </w:p>
+        </w:tc>
+      </w:tr>
+      <w:tr>
+        <w:tc>
+          <w:tcPr>
+            <w:tcW w:type="dxa" w:w="2088"/>
+            <w:tcBorders>
+              <w:top w:val="single" w:color="000000" w:sz="4"/>
+              <w:bottom w:val="single" w:color="000000" w:sz="4"/>
+            </w:tcBorders>
+          </w:tcPr>
+          <w:p>
+            <w:pPr>
+              <w:spacing w:before="40" w:after="40"/>
+              <w:jc w:val="left"/>
+            </w:pPr>
+            <w:r>
+              <w:rPr>
+                <w:rFonts w:ascii="Times New Roman" w:hAnsi="Times New Roman"/>
+                <w:b w:val="0"/>
+                <w:i w:val="0"/>
+                <w:sz w:val="16"/>
+              </w:rPr>
+              <w:t>ASUC w/o Verification Gate</w:t>
+            </w:r>
+          </w:p>
+        </w:tc>
+        <w:tc>
+          <w:tcPr>
+            <w:tcW w:type="dxa" w:w="2088"/>
+            <w:tcBorders>
+              <w:top w:val="single" w:color="000000" w:sz="4"/>
+              <w:bottom w:val="single" w:color="000000" w:sz="4"/>
+            </w:tcBorders>
+          </w:tcPr>
+          <w:p>
+            <w:pPr>
+              <w:spacing w:before="40" w:after="40"/>
+              <w:jc w:val="center"/>
+            </w:pPr>
+            <w:r>
+              <w:rPr>
+                <w:rFonts w:ascii="Times New Roman" w:hAnsi="Times New Roman"/>
+                <w:b w:val="0"/>
+                <w:i w:val="0"/>
+                <w:sz w:val="16"/>
+              </w:rPr>
+              <w:t>Rd 9</w:t>
+            </w:r>
+          </w:p>
+        </w:tc>
+        <w:tc>
+          <w:tcPr>
+            <w:tcW w:type="dxa" w:w="2088"/>
+            <w:tcBorders>
+              <w:top w:val="single" w:color="000000" w:sz="4"/>
+              <w:bottom w:val="single" w:color="000000" w:sz="4"/>
+            </w:tcBorders>
+          </w:tcPr>
+          <w:p>
+            <w:pPr>
+              <w:spacing w:before="40" w:after="40"/>
+              <w:jc w:val="center"/>
+            </w:pPr>
+            <w:r>
+              <w:rPr>
+                <w:rFonts w:ascii="Times New Roman" w:hAnsi="Times New Roman"/>
+                <w:b w:val="0"/>
+                <w:i w:val="0"/>
+                <w:sz w:val="16"/>
+              </w:rPr>
+              <w:t>81.25%</w:t>
+            </w:r>
+          </w:p>
+        </w:tc>
+        <w:tc>
+          <w:tcPr>
+            <w:tcW w:type="dxa" w:w="2088"/>
+            <w:tcBorders>
+              <w:top w:val="single" w:color="000000" w:sz="4"/>
+              <w:bottom w:val="single" w:color="000000" w:sz="4"/>
+            </w:tcBorders>
+          </w:tcPr>
+          <w:p>
+            <w:pPr>
+              <w:spacing w:before="40" w:after="40"/>
+              <w:jc w:val="center"/>
+            </w:pPr>
+            <w:r>
+              <w:rPr>
+                <w:rFonts w:ascii="Times New Roman" w:hAnsi="Times New Roman"/>
+                <w:b w:val="0"/>
+                <w:i w:val="0"/>
+                <w:sz w:val="16"/>
+              </w:rPr>
+              <w:t>0.645</w:t>
+            </w:r>
+          </w:p>
+        </w:tc>
+        <w:tc>
+          <w:tcPr>
+            <w:tcW w:type="dxa" w:w="2088"/>
+            <w:tcBorders>
+              <w:top w:val="single" w:color="000000" w:sz="4"/>
+              <w:bottom w:val="single" w:color="000000" w:sz="4"/>
+            </w:tcBorders>
+          </w:tcPr>
+          <w:p>
+            <w:pPr>
+              <w:spacing w:before="40" w:after="40"/>
+              <w:jc w:val="center"/>
+            </w:pPr>
+            <w:r>
+              <w:rPr>
+                <w:rFonts w:ascii="Times New Roman" w:hAnsi="Times New Roman"/>
+                <w:b w:val="0"/>
+                <w:i w:val="0"/>
+                <w:sz w:val="16"/>
+              </w:rPr>
+              <w:t>150.0x</w:t>
+            </w:r>
+          </w:p>
+        </w:tc>
+      </w:tr>
+      <w:tr>
+        <w:tc>
+          <w:tcPr>
+            <w:tcW w:type="dxa" w:w="2088"/>
+            <w:tcBorders>
+              <w:top w:val="single" w:color="000000" w:sz="4"/>
+              <w:bottom w:val="single" w:color="000000" w:sz="4"/>
+            </w:tcBorders>
+          </w:tcPr>
+          <w:p>
+            <w:pPr>
+              <w:spacing w:before="40" w:after="40"/>
+              <w:jc w:val="left"/>
+            </w:pPr>
+            <w:r>
+              <w:rPr>
+                <w:rFonts w:ascii="Times New Roman" w:hAnsi="Times New Roman"/>
+                <w:b/>
+                <w:i w:val="0"/>
+                <w:sz w:val="16"/>
+              </w:rPr>
+              <w:t>Full ASUC-SOM (Ours)</w:t>
+            </w:r>
+          </w:p>
+        </w:tc>
+        <w:tc>
+          <w:tcPr>
+            <w:tcW w:type="dxa" w:w="2088"/>
+            <w:tcBorders>
+              <w:top w:val="single" w:color="000000" w:sz="4"/>
+              <w:bottom w:val="single" w:color="000000" w:sz="4"/>
+            </w:tcBorders>
+          </w:tcPr>
+          <w:p>
+            <w:pPr>
+              <w:spacing w:before="40" w:after="40"/>
+              <w:jc w:val="center"/>
+            </w:pPr>
+            <w:r>
+              <w:rPr>
+                <w:rFonts w:ascii="Times New Roman" w:hAnsi="Times New Roman"/>
+                <w:b/>
+                <w:i w:val="0"/>
+                <w:sz w:val="16"/>
+              </w:rPr>
+              <w:t>None (&gt;20)</w:t>
+            </w:r>
+          </w:p>
+        </w:tc>
+        <w:tc>
+          <w:tcPr>
+            <w:tcW w:type="dxa" w:w="2088"/>
+            <w:tcBorders>
+              <w:top w:val="single" w:color="000000" w:sz="4"/>
+              <w:bottom w:val="single" w:color="000000" w:sz="4"/>
+            </w:tcBorders>
+          </w:tcPr>
+          <w:p>
+            <w:pPr>
+              <w:spacing w:before="40" w:after="40"/>
+              <w:jc w:val="center"/>
+            </w:pPr>
+            <w:r>
+              <w:rPr>
+                <w:rFonts w:ascii="Times New Roman" w:hAnsi="Times New Roman"/>
+                <w:b/>
+                <w:i w:val="0"/>
+                <w:sz w:val="16"/>
+              </w:rPr>
+              <w:t>97.19%</w:t>
+            </w:r>
+          </w:p>
+        </w:tc>
+        <w:tc>
+          <w:tcPr>
+            <w:tcW w:type="dxa" w:w="2088"/>
+            <w:tcBorders>
+              <w:top w:val="single" w:color="000000" w:sz="4"/>
+              <w:bottom w:val="single" w:color="000000" w:sz="4"/>
+            </w:tcBorders>
+          </w:tcPr>
+          <w:p>
+            <w:pPr>
+              <w:spacing w:before="40" w:after="40"/>
+              <w:jc w:val="center"/>
+            </w:pPr>
+            <w:r>
+              <w:rPr>
+                <w:rFonts w:ascii="Times New Roman" w:hAnsi="Times New Roman"/>
+                <w:b/>
+                <w:i w:val="0"/>
+                <w:sz w:val="16"/>
+              </w:rPr>
+              <w:t>0.546</w:t>
+            </w:r>
+          </w:p>
+        </w:tc>
+        <w:tc>
+          <w:tcPr>
+            <w:tcW w:type="dxa" w:w="2088"/>
+            <w:tcBorders>
+              <w:top w:val="single" w:color="000000" w:sz="4"/>
+              <w:bottom w:val="single" w:color="000000" w:sz="4"/>
+            </w:tcBorders>
+          </w:tcPr>
+          <w:p>
+            <w:pPr>
+              <w:spacing w:before="40" w:after="40"/>
+              <w:jc w:val="center"/>
+            </w:pPr>
+            <w:r>
+              <w:rPr>
+                <w:rFonts w:ascii="Times New Roman" w:hAnsi="Times New Roman"/>
+                <w:b/>
+                <w:i w:val="0"/>
+                <w:sz w:val="16"/>
+              </w:rPr>
+              <w:t>148.0x</w:t>
+            </w:r>
+          </w:p>
+        </w:tc>
+      </w:tr>
+    </w:tbl>
+    <w:p>
+      <w:pPr>
         <w:keepNext/>
         <w:spacing w:before="160" w:after="40"/>
         <w:jc w:val="left"/>

</xml_diff>